<commit_message>
Add sample CSV files for database usage and study room bookings; update README for clarity
</commit_message>
<xml_diff>
--- a/LLMs-101-handout-v2.docx
+++ b/LLMs-101-handout-v2.docx
@@ -1608,6 +1608,31 @@
           </w:p>
           <w:p>
             <w:pPr>
+              <w:spacing w:before="0" w:after="45" w:line="228"/>
+            </w:pPr>
+            <w:r>
+              <w:rPr>
+                <w:rFonts w:ascii="Calibri" w:hAnsi="Calibri" w:eastAsia="Calibri" w:cs="Calibri"/>
+                <w:b/>
+                <w:bCs/>
+                <w:color w:val="222222"/>
+                <w:sz w:val="18"/>
+                <w:szCs w:val="18"/>
+              </w:rPr>
+              <w:t>D · Break it on purpose</w:t>
+            </w:r>
+            <w:r>
+              <w:rPr>
+                <w:rFonts w:ascii="Calibri" w:hAnsi="Calibri" w:eastAsia="Calibri" w:cs="Calibri"/>
+                <w:color w:val="222222"/>
+                <w:sz w:val="18"/>
+                <w:szCs w:val="18"/>
+              </w:rPr>
+              <w:t xml:space="preserve"> (5 min). Ask for five sources on a topic you know well. Check every one — see side two.</w:t>
+            </w:r>
+          </w:p>
+          <w:p>
+            <w:pPr>
               <w:spacing w:before="0" w:after="70" w:line="228"/>
             </w:pPr>
             <w:r>
@@ -1619,16 +1644,36 @@
                 <w:sz w:val="18"/>
                 <w:szCs w:val="18"/>
               </w:rPr>
-              <w:t>D · Break it on purpose</w:t>
-            </w:r>
-            <w:r>
-              <w:rPr>
-                <w:rFonts w:ascii="Calibri" w:hAnsi="Calibri" w:eastAsia="Calibri" w:cs="Calibri"/>
-                <w:color w:val="222222"/>
-                <w:sz w:val="18"/>
-                <w:szCs w:val="18"/>
-              </w:rPr>
-              <w:t xml:space="preserve"> (5 min). Ask for five sources on a topic you know well. Check every one — see side two.</w:t>
+              <w:t>E · Work with a data table</w:t>
+            </w:r>
+            <w:r>
+              <w:rPr>
+                <w:rFonts w:ascii="Calibri" w:hAnsi="Calibri" w:eastAsia="Calibri" w:cs="Calibri"/>
+                <w:color w:val="222222"/>
+                <w:sz w:val="18"/>
+                <w:szCs w:val="18"/>
+              </w:rPr>
+              <w:t xml:space="preserve"> (5 min). Ask for cost per download from </w:t>
+            </w:r>
+            <w:r>
+              <w:rPr>
+                <w:rFonts w:ascii="Consolas" w:hAnsi="Consolas" w:eastAsia="Consolas" w:cs="Consolas"/>
+                <w:b/>
+                <w:bCs/>
+                <w:color w:val="3D1E66"/>
+                <w:sz w:val="17"/>
+                <w:szCs w:val="17"/>
+              </w:rPr>
+              <w:t>database-usage-fy2026.csv</w:t>
+            </w:r>
+            <w:r>
+              <w:rPr>
+                <w:rFonts w:ascii="Calibri" w:hAnsi="Calibri" w:eastAsia="Calibri" w:cs="Calibri"/>
+                <w:color w:val="222222"/>
+                <w:sz w:val="18"/>
+                <w:szCs w:val="18"/>
+              </w:rPr>
+              <w:t>, then total one database yourself to check its math.</w:t>
             </w:r>
           </w:p>
           <w:p>

</xml_diff>